<commit_message>
Enhance OneAI Comparison Rows and FAQ Functionality
- Updated the `getOneaiComparisonRows` function to return eleven localized rows for both English and Indonesian, adding new features and advantages for better user clarity.
- Modified the `getDefaultOneaiFaqs` function to return eight localized FAQ entries for both languages, including new questions and answers to improve user support.
- Adjusted test cases to reflect the increased number of comparison rows and FAQ entries, ensuring accurate validation of the new content.
- Updated localization files to include additional features and FAQs, enhancing the comprehensiveness of information provided to users.

These changes aim to improve user experience by providing more detailed and relevant comparisons and FAQs in both languages.
</commit_message>
<xml_diff>
--- a/public/documents/oneai-leadership-memo-en.docx
+++ b/public/documents/oneai-leadership-memo-en.docx
@@ -646,7 +646,7 @@
           <w:color w:val="425466"/>
           <w:sz w:val="22"/>
         </w:rPr>
-        <w:t>Zero Data Retention (ZDR), so company data is not kept for model training.</w:t>
+        <w:t>OneAI is installed on our premises so data stays with us — Hyperjump maintains it. Or they run an isolated instance for us only. Zero Data Retention (ZDR): data is not kept for model training.</w:t>
       </w:r>
     </w:p>
     <w:p>
@@ -784,6 +784,22 @@
           <w:sz w:val="22"/>
         </w:rPr>
         <w:t>Latest models as they launch (OpenAI, Anthropic, DeepSeek, and others); admins choose what each team can use.</w:t>
+      </w:r>
+    </w:p>
+    <w:p>
+      <w:pPr>
+        <w:pStyle w:val="ListBullet"/>
+        <w:spacing w:before="0" w:after="60" w:line="276" w:lineRule="auto"/>
+      </w:pPr>
+      <w:r>
+        <w:rPr>
+          <w:rFonts w:ascii="Calibri" w:hAnsi="Calibri" w:eastAsia="Calibri"/>
+          <w:b w:val="0"/>
+          <w:i w:val="0"/>
+          <w:color w:val="425466"/>
+          <w:sz w:val="22"/>
+        </w:rPr>
+        <w:t>Installed on-prem (Hyperjump maintains it) or on an isolated managed server for our company only.</w:t>
       </w:r>
     </w:p>
     <w:p>
@@ -1386,7 +1402,7 @@
                 <w:color w:val="0A2540"/>
                 <w:sz w:val="18"/>
               </w:rPr>
-              <w:t>One invoice &amp; usage reports</w:t>
+              <w:t>On-prem or isolated instance</w:t>
             </w:r>
           </w:p>
         </w:tc>
@@ -1440,6 +1456,116 @@
                 <w:color w:val="425466"/>
                 <w:sz w:val="18"/>
               </w:rPr>
+              <w:t>Vendor cloud</w:t>
+            </w:r>
+          </w:p>
+        </w:tc>
+        <w:tc>
+          <w:tcPr>
+            <w:tcW w:type="dxa" w:w="2268"/>
+            <w:shd w:fill="F6F8F9" w:val="clear"/>
+            <w:tcBorders>
+              <w:top w:val="single" w:sz="4" w:space="0" w:color="D9E4EE"/>
+              <w:left w:val="single" w:sz="4" w:space="0" w:color="D9E4EE"/>
+              <w:bottom w:val="single" w:sz="4" w:space="0" w:color="D9E4EE"/>
+              <w:right w:val="single" w:sz="4" w:space="0" w:color="D9E4EE"/>
+            </w:tcBorders>
+          </w:tcPr>
+          <w:p>
+            <w:pPr>
+              <w:spacing w:before="40" w:after="40" w:line="276" w:lineRule="auto"/>
+            </w:pPr>
+            <w:r>
+              <w:rPr>
+                <w:rFonts w:ascii="Calibri" w:hAnsi="Calibri" w:eastAsia="Calibri"/>
+                <w:b/>
+                <w:i w:val="0"/>
+                <w:color w:val="0A2540"/>
+                <w:sz w:val="18"/>
+              </w:rPr>
+              <w:t>Yes</w:t>
+            </w:r>
+          </w:p>
+        </w:tc>
+      </w:tr>
+      <w:tr>
+        <w:tc>
+          <w:tcPr>
+            <w:tcW w:type="dxa" w:w="2494"/>
+            <w:shd w:fill="FFFFFF" w:val="clear"/>
+            <w:tcBorders>
+              <w:top w:val="single" w:sz="4" w:space="0" w:color="D9E4EE"/>
+              <w:left w:val="single" w:sz="4" w:space="0" w:color="D9E4EE"/>
+              <w:bottom w:val="single" w:sz="4" w:space="0" w:color="D9E4EE"/>
+              <w:right w:val="single" w:sz="4" w:space="0" w:color="D9E4EE"/>
+            </w:tcBorders>
+          </w:tcPr>
+          <w:p>
+            <w:pPr>
+              <w:spacing w:before="40" w:after="40" w:line="276" w:lineRule="auto"/>
+            </w:pPr>
+            <w:r>
+              <w:rPr>
+                <w:rFonts w:ascii="Calibri" w:hAnsi="Calibri" w:eastAsia="Calibri"/>
+                <w:b/>
+                <w:i w:val="0"/>
+                <w:color w:val="0A2540"/>
+                <w:sz w:val="18"/>
+              </w:rPr>
+              <w:t>One invoice &amp; usage reports</w:t>
+            </w:r>
+          </w:p>
+        </w:tc>
+        <w:tc>
+          <w:tcPr>
+            <w:tcW w:type="dxa" w:w="2324"/>
+            <w:shd w:fill="FFFFFF" w:val="clear"/>
+            <w:tcBorders>
+              <w:top w:val="single" w:sz="4" w:space="0" w:color="D9E4EE"/>
+              <w:left w:val="single" w:sz="4" w:space="0" w:color="D9E4EE"/>
+              <w:bottom w:val="single" w:sz="4" w:space="0" w:color="D9E4EE"/>
+              <w:right w:val="single" w:sz="4" w:space="0" w:color="D9E4EE"/>
+            </w:tcBorders>
+          </w:tcPr>
+          <w:p>
+            <w:pPr>
+              <w:spacing w:before="40" w:after="40" w:line="276" w:lineRule="auto"/>
+            </w:pPr>
+            <w:r>
+              <w:rPr>
+                <w:rFonts w:ascii="Calibri" w:hAnsi="Calibri" w:eastAsia="Calibri"/>
+                <w:b w:val="0"/>
+                <w:i w:val="0"/>
+                <w:color w:val="425466"/>
+                <w:sz w:val="18"/>
+              </w:rPr>
+              <w:t>No</w:t>
+            </w:r>
+          </w:p>
+        </w:tc>
+        <w:tc>
+          <w:tcPr>
+            <w:tcW w:type="dxa" w:w="2324"/>
+            <w:shd w:fill="FFFFFF" w:val="clear"/>
+            <w:tcBorders>
+              <w:top w:val="single" w:sz="4" w:space="0" w:color="D9E4EE"/>
+              <w:left w:val="single" w:sz="4" w:space="0" w:color="D9E4EE"/>
+              <w:bottom w:val="single" w:sz="4" w:space="0" w:color="D9E4EE"/>
+              <w:right w:val="single" w:sz="4" w:space="0" w:color="D9E4EE"/>
+            </w:tcBorders>
+          </w:tcPr>
+          <w:p>
+            <w:pPr>
+              <w:spacing w:before="40" w:after="40" w:line="276" w:lineRule="auto"/>
+            </w:pPr>
+            <w:r>
+              <w:rPr>
+                <w:rFonts w:ascii="Calibri" w:hAnsi="Calibri" w:eastAsia="Calibri"/>
+                <w:b w:val="0"/>
+                <w:i w:val="0"/>
+                <w:color w:val="425466"/>
+                <w:sz w:val="18"/>
+              </w:rPr>
               <w:t>ChatGPT only</w:t>
             </w:r>
           </w:p>
@@ -1447,7 +1573,7 @@
         <w:tc>
           <w:tcPr>
             <w:tcW w:type="dxa" w:w="2268"/>
-            <w:shd w:fill="F6F8F9" w:val="clear"/>
+            <w:shd w:fill="FFFFFF" w:val="clear"/>
             <w:tcBorders>
               <w:top w:val="single" w:sz="4" w:space="0" w:color="D9E4EE"/>
               <w:left w:val="single" w:sz="4" w:space="0" w:color="D9E4EE"/>

</xml_diff>

<commit_message>
Update OneAI Comparison Rows and Localization Enhancements
- Modified the `getOneaiComparisonRows` function to set the `advantage` field to null for specific rows, reflecting updated comparison criteria.
- Enhanced test cases for `getOneaiComparisonRows` to validate new expectations, including localized content for both English and Indonesian.
- Updated localization files to improve clarity in pricing and feature descriptions, ensuring accurate representation of OneAI's offerings.
- Adjusted the leadership memo generation script to reflect updated pricing and comparison details.

These changes aim to refine the user experience by providing clearer comparisons and localized content, ensuring users have accurate and relevant information.
</commit_message>
<xml_diff>
--- a/public/documents/oneai-leadership-memo-en.docx
+++ b/public/documents/oneai-leadership-memo-en.docx
@@ -847,7 +847,7 @@
           <w:color w:val="425466"/>
           <w:sz w:val="22"/>
         </w:rPr>
-        <w:t>At 40 users, ChatGPT Business is about Rp16 million / month before extra credits. OneAI stays at Rp12.4 million with credit included. The attached PDF has the full comparison table.</w:t>
+        <w:t>At 40 users, ChatGPT Business is about Rp16 million monthly or Rp12.8 million annually. OneAI stays at Rp12.4 million. Those prices are close. The case is one platform across vendors, not cheaper chat. The attached PDF has the full comparison table.</w:t>
       </w:r>
     </w:p>
     <w:tbl>
@@ -1126,7 +1126,7 @@
                 <w:color w:val="425466"/>
                 <w:sz w:val="18"/>
               </w:rPr>
-              <w:t>Rp16.000.000</w:t>
+              <w:t>Rp16.0M / Rp12.8M yr</w:t>
             </w:r>
           </w:p>
         </w:tc>
@@ -1182,7 +1182,7 @@
                 <w:color w:val="0A2540"/>
                 <w:sz w:val="18"/>
               </w:rPr>
-              <w:t>AI credit</w:t>
+              <w:t>Usage budget</w:t>
             </w:r>
           </w:p>
         </w:tc>
@@ -1236,7 +1236,7 @@
                 <w:color w:val="425466"/>
                 <w:sz w:val="18"/>
               </w:rPr>
-              <w:t>Bought separately</w:t>
+              <w:t>Included in ChatGPT</w:t>
             </w:r>
           </w:p>
         </w:tc>
@@ -1263,7 +1263,7 @@
                 <w:color w:val="0A2540"/>
                 <w:sz w:val="18"/>
               </w:rPr>
-              <w:t>USD 300 included</w:t>
+              <w:t>USD 300 across providers</w:t>
             </w:r>
           </w:p>
         </w:tc>
@@ -1611,7 +1611,7 @@
           <w:color w:val="8898AA"/>
           <w:sz w:val="18"/>
         </w:rPr>
-        <w:t>Assumptions in the public comparison: Rp16.000/USD; stipend example Rp500.000/person; ChatGPT Business $25/user/month. Competitor prices may change; these figures are for comparison, not their quotes. Tax is extra.</w:t>
+        <w:t>Assumptions in the public comparison: Rp16.000/USD; stipend example Rp500.000/person; ChatGPT Business $25/user monthly or $20/user annually. ChatGPT includes model usage; extra credits are optional. Competitor prices may change; these figures are for comparison, not their quotes. Tax is extra.</w:t>
       </w:r>
     </w:p>
     <w:p>

</xml_diff>

<commit_message>
Refactor OneAI Messaging and Localization Updates
- Standardized the use of colons instead of dashes in subject lines and titles across various test files and localization files for consistency.
- Enhanced the clarity of descriptions and taglines in both English and Indonesian localization files, ensuring accurate representation of OneAI's features and offerings.
- Updated the leadership memo generation script to reflect these changes, improving the overall coherence of messaging.

These updates aim to provide a more uniform and clear communication style across the OneAI platform, enhancing user understanding and engagement.
</commit_message>
<xml_diff>
--- a/public/documents/oneai-leadership-memo-en.docx
+++ b/public/documents/oneai-leadership-memo-en.docx
@@ -521,7 +521,7 @@
           <w:color w:val="425466"/>
           <w:sz w:val="22"/>
         </w:rPr>
-        <w:t>I recommend we evaluate OneAI from Hyperjump Technology as our company-wide AI platform — or, at minimum, schedule a short briefing with the vendor.</w:t>
+        <w:t>I recommend we evaluate OneAI from Hyperjump Technology as our company-wide AI platform, or at minimum schedule a short briefing with the vendor.</w:t>
       </w:r>
     </w:p>
     <w:p>
@@ -537,7 +537,7 @@
           <w:color w:val="425466"/>
           <w:sz w:val="22"/>
         </w:rPr>
-        <w:t>This is not a request to replace personal ChatGPT for a handful of people. It is a request to decide how we will govern AI once 20–40 of us are already using it.</w:t>
+        <w:t>This is not a request to replace personal ChatGPT for a handful of people. It is a request to decide how we will govern AI once 20-40 of us are already using it.</w:t>
       </w:r>
     </w:p>
     <w:p>
@@ -584,7 +584,7 @@
           <w:color w:val="0A2540"/>
           <w:sz w:val="22"/>
         </w:rPr>
-        <w:t xml:space="preserve">Control — </w:t>
+        <w:t xml:space="preserve">Control: </w:t>
       </w:r>
       <w:r>
         <w:rPr>
@@ -610,7 +610,7 @@
           <w:color w:val="0A2540"/>
           <w:sz w:val="22"/>
         </w:rPr>
-        <w:t xml:space="preserve">A single budget — </w:t>
+        <w:t xml:space="preserve">A single budget: </w:t>
       </w:r>
       <w:r>
         <w:rPr>
@@ -620,7 +620,7 @@
           <w:color w:val="425466"/>
           <w:sz w:val="22"/>
         </w:rPr>
-        <w:t>one invoice instead of 20–40 subscriptions and unverified stipends.</w:t>
+        <w:t>one invoice instead of 20-40 subscriptions and unverified stipends.</w:t>
       </w:r>
     </w:p>
     <w:p>
@@ -636,7 +636,7 @@
           <w:color w:val="0A2540"/>
           <w:sz w:val="22"/>
         </w:rPr>
-        <w:t xml:space="preserve">A clear data posture — </w:t>
+        <w:t xml:space="preserve">A clear data posture: </w:t>
       </w:r>
       <w:r>
         <w:rPr>
@@ -646,7 +646,7 @@
           <w:color w:val="425466"/>
           <w:sz w:val="22"/>
         </w:rPr>
-        <w:t>OneAI is installed on our premises so data stays with us — Hyperjump maintains it. Or they run an isolated instance for us only. Zero Data Retention (ZDR): data is not kept for model training.</w:t>
+        <w:t>OneAI is installed on our premises so data stays with us. Hyperjump maintains it. Or they run an isolated instance for us only. Zero Data Retention (ZDR): data is not kept for model training.</w:t>
       </w:r>
     </w:p>
     <w:p>
@@ -662,7 +662,7 @@
           <w:color w:val="0A2540"/>
           <w:sz w:val="22"/>
         </w:rPr>
-        <w:t xml:space="preserve">Real capability — </w:t>
+        <w:t xml:space="preserve">Real capability: </w:t>
       </w:r>
       <w:r>
         <w:rPr>
@@ -899,7 +899,7 @@
                 <w:color w:val="425466"/>
                 <w:sz w:val="20"/>
               </w:rPr>
-              <w:t>If we have fewer than 20 people and only need chat, ChatGPT Plus or Business is usually enough and cheaper. OneAI is meant for a company that needs one platform — control, multiple models, and one budget — not 20–40 subscriptions.</w:t>
+              <w:t>If we have fewer than 20 people and only need chat, ChatGPT Plus or Business is usually enough and cheaper. OneAI is meant for a company that needs one platform: control, multiple models, and one budget, not 20-40 subscriptions.</w:t>
             </w:r>
           </w:p>
         </w:tc>
@@ -1671,7 +1671,7 @@
           <w:color w:val="425466"/>
           <w:sz w:val="22"/>
         </w:rPr>
-        <w:t>3. Decide after that call — adopt, wait, or stay with the current approach.</w:t>
+        <w:t>3. Decide after that call: adopt, wait, or stay with the current approach.</w:t>
       </w:r>
     </w:p>
     <w:p>

</xml_diff>

<commit_message>
Update OneAI Leadership Memo and Localization Files
- Revised the leadership memo content to reflect a one-page format, enhancing clarity and conciseness.
- Updated localization files for English and Indonesian to align with the new memo structure and terminology.
- Improved PDF generation scripts to accommodate the updated memo format and ensure consistent presentation across documents.

These changes aim to streamline communication and improve user understanding of OneAI's offerings through clearer and more localized content.
</commit_message>
<xml_diff>
--- a/public/documents/oneai-leadership-memo-en.docx
+++ b/public/documents/oneai-leadership-memo-en.docx
@@ -28,7 +28,7 @@
           </w:tcPr>
           <w:p>
             <w:pPr>
-              <w:spacing w:before="80" w:after="0" w:line="276" w:lineRule="auto"/>
+              <w:spacing w:before="40" w:after="0" w:line="259" w:lineRule="auto"/>
               <w:jc w:val="left"/>
             </w:pPr>
             <w:r>
@@ -37,14 +37,14 @@
                 <w:b/>
                 <w:i w:val="0"/>
                 <w:color w:val="00D4AA"/>
-                <w:sz w:val="18"/>
+                <w:sz w:val="16"/>
               </w:rPr>
               <w:t>HYPERJUMP TECHNOLOGY</w:t>
             </w:r>
           </w:p>
           <w:p>
             <w:pPr>
-              <w:spacing w:before="0" w:after="0" w:line="276" w:lineRule="auto"/>
+              <w:spacing w:before="0" w:after="0" w:line="259" w:lineRule="auto"/>
             </w:pPr>
             <w:r>
               <w:rPr>
@@ -52,14 +52,14 @@
                 <w:b/>
                 <w:i w:val="0"/>
                 <w:color w:val="FFFFFF"/>
-                <w:sz w:val="44"/>
+                <w:sz w:val="36"/>
               </w:rPr>
               <w:t>OneAI</w:t>
             </w:r>
           </w:p>
           <w:p>
             <w:pPr>
-              <w:spacing w:before="40" w:after="80" w:line="276" w:lineRule="auto"/>
+              <w:spacing w:before="20" w:after="40" w:line="259" w:lineRule="auto"/>
             </w:pPr>
             <w:r>
               <w:rPr>
@@ -67,9 +67,9 @@
                 <w:b w:val="0"/>
                 <w:i w:val="0"/>
                 <w:color w:val="C8D9EB"/>
-                <w:sz w:val="20"/>
+                <w:sz w:val="18"/>
               </w:rPr>
-              <w:t>Internal memo  ·  send to your manager or leadership</w:t>
+              <w:t>Internal memo  ·  one page  ·  send to your manager or leadership</w:t>
             </w:r>
           </w:p>
         </w:tc>
@@ -77,7 +77,7 @@
     </w:tbl>
     <w:p>
       <w:pPr>
-        <w:spacing w:before="0" w:after="160" w:line="276" w:lineRule="auto"/>
+        <w:spacing w:before="0" w:after="120" w:line="259" w:lineRule="auto"/>
       </w:pPr>
     </w:p>
     <w:tbl>
@@ -104,7 +104,7 @@
           </w:tcPr>
           <w:p>
             <w:pPr>
-              <w:spacing w:before="40" w:after="40" w:line="276" w:lineRule="auto"/>
+              <w:spacing w:before="20" w:after="20" w:line="259" w:lineRule="auto"/>
             </w:pPr>
             <w:r>
               <w:rPr>
@@ -112,7 +112,7 @@
                 <w:b w:val="0"/>
                 <w:i w:val="0"/>
                 <w:color w:val="6B5300"/>
-                <w:sz w:val="20"/>
+                <w:sz w:val="18"/>
               </w:rPr>
               <w:t xml:space="preserve">How to use this file: replace every </w:t>
             </w:r>
@@ -122,7 +122,7 @@
                 <w:b/>
                 <w:i w:val="0"/>
                 <w:color w:val="8A5A00"/>
-                <w:sz w:val="20"/>
+                <w:sz w:val="18"/>
                 <w:highlight w:val="yellow"/>
               </w:rPr>
               <w:t>[bracketed]</w:t>
@@ -133,7 +133,7 @@
                 <w:b w:val="0"/>
                 <w:i w:val="0"/>
                 <w:color w:val="6B5300"/>
-                <w:sz w:val="20"/>
+                <w:sz w:val="18"/>
               </w:rPr>
               <w:t xml:space="preserve"> field, attach the OneAI two-page PDF overview, then delete this yellow box before you send.</w:t>
             </w:r>
@@ -143,7 +143,7 @@
     </w:tbl>
     <w:p>
       <w:pPr>
-        <w:spacing w:before="0" w:after="120" w:line="276" w:lineRule="auto"/>
+        <w:spacing w:before="0" w:after="80" w:line="259" w:lineRule="auto"/>
       </w:pPr>
     </w:p>
     <w:tbl>
@@ -172,7 +172,7 @@
           </w:tcPr>
           <w:p>
             <w:pPr>
-              <w:spacing w:before="40" w:after="40" w:line="276" w:lineRule="auto"/>
+              <w:spacing w:before="20" w:after="20" w:line="259" w:lineRule="auto"/>
             </w:pPr>
             <w:r>
               <w:rPr>
@@ -180,7 +180,7 @@
                 <w:b/>
                 <w:i w:val="0"/>
                 <w:color w:val="0A2540"/>
-                <w:sz w:val="20"/>
+                <w:sz w:val="18"/>
               </w:rPr>
               <w:t>To</w:t>
             </w:r>
@@ -199,7 +199,7 @@
           </w:tcPr>
           <w:p>
             <w:pPr>
-              <w:spacing w:before="40" w:after="40" w:line="276" w:lineRule="auto"/>
+              <w:spacing w:before="20" w:after="20" w:line="259" w:lineRule="auto"/>
             </w:pPr>
             <w:r>
               <w:rPr>
@@ -207,7 +207,7 @@
                 <w:b/>
                 <w:i w:val="0"/>
                 <w:color w:val="8A5A00"/>
-                <w:sz w:val="22"/>
+                <w:sz w:val="21"/>
                 <w:highlight w:val="yellow"/>
               </w:rPr>
               <w:t>[Name]</w:t>
@@ -218,7 +218,7 @@
                 <w:b w:val="0"/>
                 <w:i w:val="0"/>
                 <w:color w:val="0A2540"/>
-                <w:sz w:val="22"/>
+                <w:sz w:val="21"/>
               </w:rPr>
               <w:t xml:space="preserve">, </w:t>
             </w:r>
@@ -228,7 +228,7 @@
                 <w:b/>
                 <w:i w:val="0"/>
                 <w:color w:val="8A5A00"/>
-                <w:sz w:val="22"/>
+                <w:sz w:val="21"/>
                 <w:highlight w:val="yellow"/>
               </w:rPr>
               <w:t>[Title]</w:t>
@@ -251,7 +251,7 @@
           </w:tcPr>
           <w:p>
             <w:pPr>
-              <w:spacing w:before="40" w:after="40" w:line="276" w:lineRule="auto"/>
+              <w:spacing w:before="20" w:after="20" w:line="259" w:lineRule="auto"/>
             </w:pPr>
             <w:r>
               <w:rPr>
@@ -259,7 +259,7 @@
                 <w:b/>
                 <w:i w:val="0"/>
                 <w:color w:val="0A2540"/>
-                <w:sz w:val="20"/>
+                <w:sz w:val="18"/>
               </w:rPr>
               <w:t>From</w:t>
             </w:r>
@@ -278,7 +278,7 @@
           </w:tcPr>
           <w:p>
             <w:pPr>
-              <w:spacing w:before="40" w:after="40" w:line="276" w:lineRule="auto"/>
+              <w:spacing w:before="20" w:after="20" w:line="259" w:lineRule="auto"/>
             </w:pPr>
             <w:r>
               <w:rPr>
@@ -286,7 +286,7 @@
                 <w:b/>
                 <w:i w:val="0"/>
                 <w:color w:val="8A5A00"/>
-                <w:sz w:val="22"/>
+                <w:sz w:val="21"/>
                 <w:highlight w:val="yellow"/>
               </w:rPr>
               <w:t>[Your name]</w:t>
@@ -297,7 +297,7 @@
                 <w:b w:val="0"/>
                 <w:i w:val="0"/>
                 <w:color w:val="0A2540"/>
-                <w:sz w:val="22"/>
+                <w:sz w:val="21"/>
               </w:rPr>
               <w:t xml:space="preserve">, </w:t>
             </w:r>
@@ -307,7 +307,7 @@
                 <w:b/>
                 <w:i w:val="0"/>
                 <w:color w:val="8A5A00"/>
-                <w:sz w:val="22"/>
+                <w:sz w:val="21"/>
                 <w:highlight w:val="yellow"/>
               </w:rPr>
               <w:t>[Role / department]</w:t>
@@ -330,7 +330,7 @@
           </w:tcPr>
           <w:p>
             <w:pPr>
-              <w:spacing w:before="40" w:after="40" w:line="276" w:lineRule="auto"/>
+              <w:spacing w:before="20" w:after="20" w:line="259" w:lineRule="auto"/>
             </w:pPr>
             <w:r>
               <w:rPr>
@@ -338,7 +338,7 @@
                 <w:b/>
                 <w:i w:val="0"/>
                 <w:color w:val="0A2540"/>
-                <w:sz w:val="20"/>
+                <w:sz w:val="18"/>
               </w:rPr>
               <w:t>Date</w:t>
             </w:r>
@@ -357,7 +357,7 @@
           </w:tcPr>
           <w:p>
             <w:pPr>
-              <w:spacing w:before="40" w:after="40" w:line="276" w:lineRule="auto"/>
+              <w:spacing w:before="20" w:after="20" w:line="259" w:lineRule="auto"/>
             </w:pPr>
             <w:r>
               <w:rPr>
@@ -365,7 +365,7 @@
                 <w:b/>
                 <w:i w:val="0"/>
                 <w:color w:val="8A5A00"/>
-                <w:sz w:val="22"/>
+                <w:sz w:val="21"/>
                 <w:highlight w:val="yellow"/>
               </w:rPr>
               <w:t>[Date]</w:t>
@@ -388,7 +388,7 @@
           </w:tcPr>
           <w:p>
             <w:pPr>
-              <w:spacing w:before="40" w:after="40" w:line="276" w:lineRule="auto"/>
+              <w:spacing w:before="20" w:after="20" w:line="259" w:lineRule="auto"/>
             </w:pPr>
             <w:r>
               <w:rPr>
@@ -396,7 +396,7 @@
                 <w:b/>
                 <w:i w:val="0"/>
                 <w:color w:val="0A2540"/>
-                <w:sz w:val="20"/>
+                <w:sz w:val="18"/>
               </w:rPr>
               <w:t>Subject</w:t>
             </w:r>
@@ -415,7 +415,7 @@
           </w:tcPr>
           <w:p>
             <w:pPr>
-              <w:spacing w:before="40" w:after="40" w:line="276" w:lineRule="auto"/>
+              <w:spacing w:before="20" w:after="20" w:line="259" w:lineRule="auto"/>
             </w:pPr>
             <w:r>
               <w:rPr>
@@ -423,7 +423,7 @@
                 <w:b w:val="0"/>
                 <w:i w:val="0"/>
                 <w:color w:val="0A2540"/>
-                <w:sz w:val="22"/>
+                <w:sz w:val="21"/>
               </w:rPr>
               <w:t>Recommendation to evaluate OneAI as our company AI platform</w:t>
             </w:r>
@@ -445,7 +445,7 @@
           </w:tcPr>
           <w:p>
             <w:pPr>
-              <w:spacing w:before="40" w:after="40" w:line="276" w:lineRule="auto"/>
+              <w:spacing w:before="20" w:after="20" w:line="259" w:lineRule="auto"/>
             </w:pPr>
             <w:r>
               <w:rPr>
@@ -453,7 +453,7 @@
                 <w:b/>
                 <w:i w:val="0"/>
                 <w:color w:val="0A2540"/>
-                <w:sz w:val="20"/>
+                <w:sz w:val="18"/>
               </w:rPr>
               <w:t>Attachments</w:t>
             </w:r>
@@ -472,7 +472,7 @@
           </w:tcPr>
           <w:p>
             <w:pPr>
-              <w:spacing w:before="40" w:after="40" w:line="276" w:lineRule="auto"/>
+              <w:spacing w:before="20" w:after="20" w:line="259" w:lineRule="auto"/>
             </w:pPr>
             <w:r>
               <w:rPr>
@@ -480,7 +480,7 @@
                 <w:b w:val="0"/>
                 <w:i w:val="0"/>
                 <w:color w:val="0A2540"/>
-                <w:sz w:val="22"/>
+                <w:sz w:val="21"/>
               </w:rPr>
               <w:t>OneAI two-page overview (PDF)</w:t>
             </w:r>
@@ -490,12 +490,12 @@
     </w:tbl>
     <w:p>
       <w:pPr>
-        <w:spacing w:before="0" w:after="80" w:line="276" w:lineRule="auto"/>
+        <w:spacing w:before="0" w:after="40" w:line="259" w:lineRule="auto"/>
       </w:pPr>
     </w:p>
     <w:p>
       <w:pPr>
-        <w:spacing w:before="280" w:after="120" w:line="276" w:lineRule="auto"/>
+        <w:spacing w:before="160" w:after="60" w:line="259" w:lineRule="auto"/>
       </w:pPr>
       <w:r>
         <w:rPr>
@@ -503,14 +503,14 @@
           <w:b/>
           <w:i w:val="0"/>
           <w:color w:val="0A2540"/>
-          <w:sz w:val="26"/>
+          <w:sz w:val="24"/>
         </w:rPr>
         <w:t>1. Request</w:t>
       </w:r>
     </w:p>
     <w:p>
       <w:pPr>
-        <w:spacing w:before="0" w:after="160" w:line="276" w:lineRule="auto"/>
+        <w:spacing w:before="0" w:after="120" w:line="259" w:lineRule="auto"/>
         <w:jc w:val="both"/>
       </w:pPr>
       <w:r>
@@ -521,12 +521,27 @@
           <w:color w:val="425466"/>
           <w:sz w:val="22"/>
         </w:rPr>
-        <w:t>I recommend we evaluate OneAI from Hyperjump Technology as our company-wide AI platform, or at minimum schedule a short briefing with the vendor.</w:t>
+        <w:t>I recommend we evaluate OneAI from Hyperjump Technology as our company-wide AI platform, or at minimum schedule a 30-minute briefing. This is not about replacing personal ChatGPT for a few people. It is about governing AI now that 20-40 of us already use it.</w:t>
       </w:r>
     </w:p>
     <w:p>
       <w:pPr>
-        <w:spacing w:before="0" w:after="160" w:line="276" w:lineRule="auto"/>
+        <w:spacing w:before="160" w:after="60" w:line="259" w:lineRule="auto"/>
+      </w:pPr>
+      <w:r>
+        <w:rPr>
+          <w:rFonts w:ascii="Calibri" w:hAnsi="Calibri" w:eastAsia="Calibri"/>
+          <w:b/>
+          <w:i w:val="0"/>
+          <w:color w:val="0A2540"/>
+          <w:sz w:val="24"/>
+        </w:rPr>
+        <w:t>2. Why this matters now</w:t>
+      </w:r>
+    </w:p>
+    <w:p>
+      <w:pPr>
+        <w:spacing w:before="0" w:after="80" w:line="259" w:lineRule="auto"/>
         <w:jc w:val="both"/>
       </w:pPr>
       <w:r>
@@ -537,12 +552,13 @@
           <w:color w:val="425466"/>
           <w:sz w:val="22"/>
         </w:rPr>
-        <w:t>This is not a request to replace personal ChatGPT for a handful of people. It is a request to decide how we will govern AI once 20-40 of us are already using it.</w:t>
+        <w:t>Teams are already using AI. Personal subscriptions and informal stipends do not give us:</w:t>
       </w:r>
     </w:p>
     <w:p>
       <w:pPr>
-        <w:spacing w:before="280" w:after="120" w:line="276" w:lineRule="auto"/>
+        <w:pStyle w:val="ListBullet"/>
+        <w:spacing w:before="0" w:after="40" w:line="259" w:lineRule="auto"/>
       </w:pPr>
       <w:r>
         <w:rPr>
@@ -550,14 +566,102 @@
           <w:b/>
           <w:i w:val="0"/>
           <w:color w:val="0A2540"/>
-          <w:sz w:val="26"/>
+          <w:sz w:val="21"/>
         </w:rPr>
-        <w:t>2. Why this matters now</w:t>
+        <w:t xml:space="preserve">Control: </w:t>
+      </w:r>
+      <w:r>
+        <w:rPr>
+          <w:rFonts w:ascii="Calibri" w:hAnsi="Calibri" w:eastAsia="Calibri"/>
+          <w:b w:val="0"/>
+          <w:i w:val="0"/>
+          <w:color w:val="425466"/>
+          <w:sz w:val="21"/>
+        </w:rPr>
+        <w:t>one dashboard, usage reports, and a way to choose which models are available.</w:t>
       </w:r>
     </w:p>
     <w:p>
       <w:pPr>
-        <w:spacing w:before="0" w:after="120" w:line="276" w:lineRule="auto"/>
+        <w:pStyle w:val="ListBullet"/>
+        <w:spacing w:before="0" w:after="40" w:line="259" w:lineRule="auto"/>
+      </w:pPr>
+      <w:r>
+        <w:rPr>
+          <w:rFonts w:ascii="Calibri" w:hAnsi="Calibri" w:eastAsia="Calibri"/>
+          <w:b/>
+          <w:i w:val="0"/>
+          <w:color w:val="0A2540"/>
+          <w:sz w:val="21"/>
+        </w:rPr>
+        <w:t xml:space="preserve">A single budget: </w:t>
+      </w:r>
+      <w:r>
+        <w:rPr>
+          <w:rFonts w:ascii="Calibri" w:hAnsi="Calibri" w:eastAsia="Calibri"/>
+          <w:b w:val="0"/>
+          <w:i w:val="0"/>
+          <w:color w:val="425466"/>
+          <w:sz w:val="21"/>
+        </w:rPr>
+        <w:t>one invoice instead of 20-40 subscriptions we cannot verify.</w:t>
+      </w:r>
+    </w:p>
+    <w:p>
+      <w:pPr>
+        <w:pStyle w:val="ListBullet"/>
+        <w:spacing w:before="0" w:after="40" w:line="259" w:lineRule="auto"/>
+      </w:pPr>
+      <w:r>
+        <w:rPr>
+          <w:rFonts w:ascii="Calibri" w:hAnsi="Calibri" w:eastAsia="Calibri"/>
+          <w:b/>
+          <w:i w:val="0"/>
+          <w:color w:val="0A2540"/>
+          <w:sz w:val="21"/>
+        </w:rPr>
+        <w:t xml:space="preserve">Data that stays with us: </w:t>
+      </w:r>
+      <w:r>
+        <w:rPr>
+          <w:rFonts w:ascii="Calibri" w:hAnsi="Calibri" w:eastAsia="Calibri"/>
+          <w:b w:val="0"/>
+          <w:i w:val="0"/>
+          <w:color w:val="425466"/>
+          <w:sz w:val="21"/>
+        </w:rPr>
+        <w:t>installed on our premises (Hyperjump maintains it) or an isolated instance for us only. Zero Data Retention: data is not kept for model training.</w:t>
+      </w:r>
+    </w:p>
+    <w:p>
+      <w:pPr>
+        <w:pStyle w:val="ListBullet"/>
+        <w:spacing w:before="0" w:after="40" w:line="259" w:lineRule="auto"/>
+      </w:pPr>
+      <w:r>
+        <w:rPr>
+          <w:rFonts w:ascii="Calibri" w:hAnsi="Calibri" w:eastAsia="Calibri"/>
+          <w:b/>
+          <w:i w:val="0"/>
+          <w:color w:val="0A2540"/>
+          <w:sz w:val="21"/>
+        </w:rPr>
+        <w:t xml:space="preserve">Real capability: </w:t>
+      </w:r>
+      <w:r>
+        <w:rPr>
+          <w:rFonts w:ascii="Calibri" w:hAnsi="Calibri" w:eastAsia="Calibri"/>
+          <w:b w:val="0"/>
+          <w:i w:val="0"/>
+          <w:color w:val="425466"/>
+          <w:sz w:val="21"/>
+        </w:rPr>
+        <w:t>office files, internal knowledge, code execution, and more than one model vendor.</w:t>
+      </w:r>
+    </w:p>
+    <w:p>
+      <w:pPr>
+        <w:spacing w:before="0" w:after="80" w:line="259" w:lineRule="auto"/>
         <w:jc w:val="both"/>
       </w:pPr>
       <w:r>
@@ -568,13 +672,28 @@
           <w:color w:val="425466"/>
           <w:sz w:val="22"/>
         </w:rPr>
-        <w:t>Teams are already using AI. Personal subscriptions, informal stipends, or buying credits ad hoc do not give us:</w:t>
+        <w:t>At 40 users, OneAI is Rp12.400.000 per month (USD 300 AI credit included; billed quarterly). ChatGPT Business is about Rp16 million monthly or Rp12.8 million annually. The prices are close. The case is one platform across vendors, not cheaper chat. The attached PDF has the full comparison. Tax is extra.</w:t>
       </w:r>
     </w:p>
     <w:p>
       <w:pPr>
-        <w:pStyle w:val="ListBullet"/>
-        <w:spacing w:before="0" w:after="80" w:line="276" w:lineRule="auto"/>
+        <w:spacing w:before="0" w:after="80" w:line="259" w:lineRule="auto"/>
+        <w:jc w:val="both"/>
+      </w:pPr>
+      <w:r>
+        <w:rPr>
+          <w:rFonts w:ascii="Calibri" w:hAnsi="Calibri" w:eastAsia="Calibri"/>
+          <w:b w:val="0"/>
+          <w:i/>
+          <w:color w:val="425466"/>
+          <w:sz w:val="20"/>
+        </w:rPr>
+        <w:t>If we have fewer than 20 people and only need chat, ChatGPT Plus or Business is usually enough and cheaper.</w:t>
+      </w:r>
+    </w:p>
+    <w:p>
+      <w:pPr>
+        <w:spacing w:before="160" w:after="60" w:line="259" w:lineRule="auto"/>
       </w:pPr>
       <w:r>
         <w:rPr>
@@ -582,102 +701,14 @@
           <w:b/>
           <w:i w:val="0"/>
           <w:color w:val="0A2540"/>
-          <w:sz w:val="22"/>
+          <w:sz w:val="24"/>
         </w:rPr>
-        <w:t xml:space="preserve">Control: </w:t>
-      </w:r>
-      <w:r>
-        <w:rPr>
-          <w:rFonts w:ascii="Calibri" w:hAnsi="Calibri" w:eastAsia="Calibri"/>
-          <w:b w:val="0"/>
-          <w:i w:val="0"/>
-          <w:color w:val="425466"/>
-          <w:sz w:val="22"/>
-        </w:rPr>
-        <w:t>one dashboard, usage reports, and a way to choose which models are available.</w:t>
+        <w:t>3. Proposed next step</w:t>
       </w:r>
     </w:p>
     <w:p>
       <w:pPr>
-        <w:pStyle w:val="ListBullet"/>
-        <w:spacing w:before="0" w:after="80" w:line="276" w:lineRule="auto"/>
-      </w:pPr>
-      <w:r>
-        <w:rPr>
-          <w:rFonts w:ascii="Calibri" w:hAnsi="Calibri" w:eastAsia="Calibri"/>
-          <w:b/>
-          <w:i w:val="0"/>
-          <w:color w:val="0A2540"/>
-          <w:sz w:val="22"/>
-        </w:rPr>
-        <w:t xml:space="preserve">A single budget: </w:t>
-      </w:r>
-      <w:r>
-        <w:rPr>
-          <w:rFonts w:ascii="Calibri" w:hAnsi="Calibri" w:eastAsia="Calibri"/>
-          <w:b w:val="0"/>
-          <w:i w:val="0"/>
-          <w:color w:val="425466"/>
-          <w:sz w:val="22"/>
-        </w:rPr>
-        <w:t>one invoice instead of 20-40 subscriptions and unverified stipends.</w:t>
-      </w:r>
-    </w:p>
-    <w:p>
-      <w:pPr>
-        <w:pStyle w:val="ListBullet"/>
-        <w:spacing w:before="0" w:after="80" w:line="276" w:lineRule="auto"/>
-      </w:pPr>
-      <w:r>
-        <w:rPr>
-          <w:rFonts w:ascii="Calibri" w:hAnsi="Calibri" w:eastAsia="Calibri"/>
-          <w:b/>
-          <w:i w:val="0"/>
-          <w:color w:val="0A2540"/>
-          <w:sz w:val="22"/>
-        </w:rPr>
-        <w:t xml:space="preserve">A clear data posture: </w:t>
-      </w:r>
-      <w:r>
-        <w:rPr>
-          <w:rFonts w:ascii="Calibri" w:hAnsi="Calibri" w:eastAsia="Calibri"/>
-          <w:b w:val="0"/>
-          <w:i w:val="0"/>
-          <w:color w:val="425466"/>
-          <w:sz w:val="22"/>
-        </w:rPr>
-        <w:t>OneAI is installed on our premises so data stays with us. Hyperjump maintains it. Or they run an isolated instance for us only. Zero Data Retention (ZDR): data is not kept for model training.</w:t>
-      </w:r>
-    </w:p>
-    <w:p>
-      <w:pPr>
-        <w:pStyle w:val="ListBullet"/>
-        <w:spacing w:before="0" w:after="80" w:line="276" w:lineRule="auto"/>
-      </w:pPr>
-      <w:r>
-        <w:rPr>
-          <w:rFonts w:ascii="Calibri" w:hAnsi="Calibri" w:eastAsia="Calibri"/>
-          <w:b/>
-          <w:i w:val="0"/>
-          <w:color w:val="0A2540"/>
-          <w:sz w:val="22"/>
-        </w:rPr>
-        <w:t xml:space="preserve">Real capability: </w:t>
-      </w:r>
-      <w:r>
-        <w:rPr>
-          <w:rFonts w:ascii="Calibri" w:hAnsi="Calibri" w:eastAsia="Calibri"/>
-          <w:b w:val="0"/>
-          <w:i w:val="0"/>
-          <w:color w:val="425466"/>
-          <w:sz w:val="22"/>
-        </w:rPr>
-        <w:t>office files, internal knowledge, code execution, and more than one model vendor.</w:t>
-      </w:r>
-    </w:p>
-    <w:p>
-      <w:pPr>
-        <w:spacing w:before="0" w:after="160" w:line="276" w:lineRule="auto"/>
+        <w:spacing w:before="0" w:after="80" w:line="259" w:lineRule="auto"/>
         <w:jc w:val="both"/>
       </w:pPr>
       <w:r>
@@ -688,1011 +719,12 @@
           <w:color w:val="425466"/>
           <w:sz w:val="22"/>
         </w:rPr>
-        <w:t>Money given as a stipend can be spent on anything. We pay for capacity we cannot see, and we cannot enforce company policy.</w:t>
+        <w:t>Please approve a 30-minute call with Hyperjump (solution@hyperjump.tech) to confirm fit, onboarding, and commercial terms. I am happy to coordinate and report back.</w:t>
       </w:r>
     </w:p>
     <w:p>
       <w:pPr>
-        <w:spacing w:before="280" w:after="120" w:line="276" w:lineRule="auto"/>
-      </w:pPr>
-      <w:r>
-        <w:rPr>
-          <w:rFonts w:ascii="Calibri" w:hAnsi="Calibri" w:eastAsia="Calibri"/>
-          <w:b/>
-          <w:i w:val="0"/>
-          <w:color w:val="0A2540"/>
-          <w:sz w:val="26"/>
-        </w:rPr>
-        <w:t>3. Why OneAI, specifically</w:t>
-      </w:r>
-    </w:p>
-    <w:p>
-      <w:pPr>
-        <w:spacing w:before="0" w:after="120" w:line="276" w:lineRule="auto"/>
-        <w:jc w:val="both"/>
-      </w:pPr>
-      <w:r>
-        <w:rPr>
-          <w:rFonts w:ascii="Calibri" w:hAnsi="Calibri" w:eastAsia="Calibri"/>
-          <w:b w:val="0"/>
-          <w:i w:val="0"/>
-          <w:color w:val="425466"/>
-          <w:sz w:val="22"/>
-        </w:rPr>
-        <w:t>OneAI is a unified platform for up to 40 users. Published commercial terms (before tax):</w:t>
-      </w:r>
-    </w:p>
-    <w:p>
-      <w:pPr>
-        <w:pStyle w:val="ListBullet"/>
-        <w:spacing w:before="0" w:after="60" w:line="276" w:lineRule="auto"/>
-      </w:pPr>
-      <w:r>
-        <w:rPr>
-          <w:rFonts w:ascii="Calibri" w:hAnsi="Calibri" w:eastAsia="Calibri"/>
-          <w:b w:val="0"/>
-          <w:i w:val="0"/>
-          <w:color w:val="425466"/>
-          <w:sz w:val="22"/>
-        </w:rPr>
-        <w:t>Rp12.400.000 / month, billed quarterly (Rp37.200.000 per quarter).</w:t>
-      </w:r>
-    </w:p>
-    <w:p>
-      <w:pPr>
-        <w:pStyle w:val="ListBullet"/>
-        <w:spacing w:before="0" w:after="60" w:line="276" w:lineRule="auto"/>
-      </w:pPr>
-      <w:r>
-        <w:rPr>
-          <w:rFonts w:ascii="Calibri" w:hAnsi="Calibri" w:eastAsia="Calibri"/>
-          <w:b w:val="0"/>
-          <w:i w:val="0"/>
-          <w:color w:val="425466"/>
-          <w:sz w:val="22"/>
-        </w:rPr>
-        <w:t>USD 300 AI credit included each month.</w:t>
-      </w:r>
-    </w:p>
-    <w:p>
-      <w:pPr>
-        <w:pStyle w:val="ListBullet"/>
-        <w:spacing w:before="0" w:after="60" w:line="276" w:lineRule="auto"/>
-      </w:pPr>
-      <w:r>
-        <w:rPr>
-          <w:rFonts w:ascii="Calibri" w:hAnsi="Calibri" w:eastAsia="Calibri"/>
-          <w:b w:val="0"/>
-          <w:i w:val="0"/>
-          <w:color w:val="425466"/>
-          <w:sz w:val="22"/>
-        </w:rPr>
-        <w:t>10% off with annual billing.</w:t>
-      </w:r>
-    </w:p>
-    <w:p>
-      <w:pPr>
-        <w:pStyle w:val="ListBullet"/>
-        <w:spacing w:before="0" w:after="60" w:line="276" w:lineRule="auto"/>
-      </w:pPr>
-      <w:r>
-        <w:rPr>
-          <w:rFonts w:ascii="Calibri" w:hAnsi="Calibri" w:eastAsia="Calibri"/>
-          <w:b w:val="0"/>
-          <w:i w:val="0"/>
-          <w:color w:val="425466"/>
-          <w:sz w:val="22"/>
-        </w:rPr>
-        <w:t>Latest models as they launch (OpenAI, Anthropic, DeepSeek, and others); admins choose what each team can use.</w:t>
-      </w:r>
-    </w:p>
-    <w:p>
-      <w:pPr>
-        <w:pStyle w:val="ListBullet"/>
-        <w:spacing w:before="0" w:after="60" w:line="276" w:lineRule="auto"/>
-      </w:pPr>
-      <w:r>
-        <w:rPr>
-          <w:rFonts w:ascii="Calibri" w:hAnsi="Calibri" w:eastAsia="Calibri"/>
-          <w:b w:val="0"/>
-          <w:i w:val="0"/>
-          <w:color w:val="425466"/>
-          <w:sz w:val="22"/>
-        </w:rPr>
-        <w:t>Installed on-prem (Hyperjump maintains it) or on an isolated managed server for our company only.</w:t>
-      </w:r>
-    </w:p>
-    <w:p>
-      <w:pPr>
-        <w:pStyle w:val="ListBullet"/>
-        <w:spacing w:before="0" w:after="60" w:line="276" w:lineRule="auto"/>
-      </w:pPr>
-      <w:r>
-        <w:rPr>
-          <w:rFonts w:ascii="Calibri" w:hAnsi="Calibri" w:eastAsia="Calibri"/>
-          <w:b w:val="0"/>
-          <w:i w:val="0"/>
-          <w:color w:val="425466"/>
-          <w:sz w:val="22"/>
-        </w:rPr>
-        <w:t>One team onboarding session and monthly usage reports included.</w:t>
-      </w:r>
-    </w:p>
-    <w:p>
-      <w:pPr>
-        <w:pStyle w:val="ListBullet"/>
-        <w:spacing w:before="0" w:after="60" w:line="276" w:lineRule="auto"/>
-      </w:pPr>
-      <w:r>
-        <w:rPr>
-          <w:rFonts w:ascii="Calibri" w:hAnsi="Calibri" w:eastAsia="Calibri"/>
-          <w:b w:val="0"/>
-          <w:i w:val="0"/>
-          <w:color w:val="425466"/>
-          <w:sz w:val="22"/>
-        </w:rPr>
-        <w:t>Customization (internal systems, custom SSO) is scoped separately.</w:t>
-      </w:r>
-    </w:p>
-    <w:p>
-      <w:pPr>
-        <w:spacing w:before="0" w:after="160" w:line="276" w:lineRule="auto"/>
-        <w:jc w:val="both"/>
-      </w:pPr>
-      <w:r>
-        <w:rPr>
-          <w:rFonts w:ascii="Calibri" w:hAnsi="Calibri" w:eastAsia="Calibri"/>
-          <w:b w:val="0"/>
-          <w:i w:val="0"/>
-          <w:color w:val="425466"/>
-          <w:sz w:val="22"/>
-        </w:rPr>
-        <w:t>At 40 users, ChatGPT Business is about Rp16 million monthly or Rp12.8 million annually. OneAI stays at Rp12.4 million. Those prices are close. The case is one platform across vendors, not cheaper chat. The attached PDF has the full comparison table.</w:t>
-      </w:r>
-    </w:p>
-    <w:tbl>
-      <w:tblPr>
-        <w:tblW w:type="auto" w:w="0"/>
-        <w:tblLayout w:type="fixed"/>
-        <w:tblLook w:firstColumn="1" w:firstRow="1" w:lastColumn="0" w:lastRow="0" w:noHBand="0" w:noVBand="1" w:val="04A0"/>
-        <w:tblInd w:w="0" w:type="dxa"/>
-      </w:tblPr>
-      <w:tblGrid>
-        <w:gridCol w:w="9412"/>
-      </w:tblGrid>
-      <w:tr>
-        <w:tc>
-          <w:tcPr>
-            <w:tcW w:type="dxa" w:w="9411"/>
-            <w:shd w:fill="EEF5FB" w:val="clear"/>
-            <w:tcBorders>
-              <w:top w:val="single" w:sz="8" w:space="0" w:color="635BFF"/>
-              <w:left w:val="single" w:sz="8" w:space="0" w:color="635BFF"/>
-              <w:bottom w:val="single" w:sz="8" w:space="0" w:color="635BFF"/>
-              <w:right w:val="single" w:sz="8" w:space="0" w:color="635BFF"/>
-            </w:tcBorders>
-          </w:tcPr>
-          <w:p>
-            <w:pPr>
-              <w:spacing w:before="40" w:after="40" w:line="276" w:lineRule="auto"/>
-            </w:pPr>
-            <w:r>
-              <w:rPr>
-                <w:rFonts w:ascii="Calibri" w:hAnsi="Calibri" w:eastAsia="Calibri"/>
-                <w:b/>
-                <w:i w:val="0"/>
-                <w:color w:val="635BFF"/>
-                <w:sz w:val="20"/>
-              </w:rPr>
-              <w:t>Honest caveat</w:t>
-            </w:r>
-          </w:p>
-          <w:p>
-            <w:pPr>
-              <w:spacing w:before="0" w:after="40" w:line="276" w:lineRule="auto"/>
-            </w:pPr>
-            <w:r>
-              <w:rPr>
-                <w:rFonts w:ascii="Calibri" w:hAnsi="Calibri" w:eastAsia="Calibri"/>
-                <w:b w:val="0"/>
-                <w:i w:val="0"/>
-                <w:color w:val="425466"/>
-                <w:sz w:val="20"/>
-              </w:rPr>
-              <w:t>If we have fewer than 20 people and only need chat, ChatGPT Plus or Business is usually enough and cheaper. OneAI is meant for a company that needs one platform: control, multiple models, and one budget, not 20-40 subscriptions.</w:t>
-            </w:r>
-          </w:p>
-        </w:tc>
-      </w:tr>
-    </w:tbl>
-    <w:p>
-      <w:pPr>
-        <w:spacing w:before="0" w:after="80" w:line="276" w:lineRule="auto"/>
-      </w:pPr>
-    </w:p>
-    <w:p>
-      <w:pPr>
-        <w:spacing w:before="280" w:after="120" w:line="276" w:lineRule="auto"/>
-      </w:pPr>
-      <w:r>
-        <w:rPr>
-          <w:rFonts w:ascii="Calibri" w:hAnsi="Calibri" w:eastAsia="Calibri"/>
-          <w:b/>
-          <w:i w:val="0"/>
-          <w:color w:val="0A2540"/>
-          <w:sz w:val="26"/>
-        </w:rPr>
-        <w:t>4. Cost snapshot (per month)</w:t>
-      </w:r>
-    </w:p>
-    <w:tbl>
-      <w:tblPr>
-        <w:tblW w:type="auto" w:w="0"/>
-        <w:tblLayout w:type="fixed"/>
-        <w:tblLook w:firstColumn="1" w:firstRow="1" w:lastColumn="0" w:lastRow="0" w:noHBand="0" w:noVBand="1" w:val="04A0"/>
-        <w:tblInd w:w="0" w:type="dxa"/>
-      </w:tblPr>
-      <w:tblGrid>
-        <w:gridCol w:w="2353"/>
-        <w:gridCol w:w="2353"/>
-        <w:gridCol w:w="2353"/>
-        <w:gridCol w:w="2353"/>
-      </w:tblGrid>
-      <w:tr>
-        <w:tc>
-          <w:tcPr>
-            <w:tcW w:type="dxa" w:w="2494"/>
-            <w:shd w:fill="0A2540" w:val="clear"/>
-            <w:tcBorders>
-              <w:top w:val="single" w:sz="4" w:space="0" w:color="0A2540"/>
-              <w:left w:val="single" w:sz="4" w:space="0" w:color="0A2540"/>
-              <w:bottom w:val="single" w:sz="4" w:space="0" w:color="0A2540"/>
-              <w:right w:val="single" w:sz="4" w:space="0" w:color="0A2540"/>
-            </w:tcBorders>
-          </w:tcPr>
-          <w:p>
-            <w:pPr>
-              <w:spacing w:before="60" w:after="60" w:line="276" w:lineRule="auto"/>
-            </w:pPr>
-            <w:r>
-              <w:rPr>
-                <w:rFonts w:ascii="Calibri" w:hAnsi="Calibri" w:eastAsia="Calibri"/>
-                <w:b/>
-                <w:i w:val="0"/>
-                <w:color w:val="FFFFFF"/>
-                <w:sz w:val="18"/>
-              </w:rPr>
-              <w:t>At 40 users</w:t>
-            </w:r>
-          </w:p>
-        </w:tc>
-        <w:tc>
-          <w:tcPr>
-            <w:tcW w:type="dxa" w:w="2324"/>
-            <w:shd w:fill="0A2540" w:val="clear"/>
-            <w:tcBorders>
-              <w:top w:val="single" w:sz="4" w:space="0" w:color="0A2540"/>
-              <w:left w:val="single" w:sz="4" w:space="0" w:color="0A2540"/>
-              <w:bottom w:val="single" w:sz="4" w:space="0" w:color="0A2540"/>
-              <w:right w:val="single" w:sz="4" w:space="0" w:color="0A2540"/>
-            </w:tcBorders>
-          </w:tcPr>
-          <w:p>
-            <w:pPr>
-              <w:spacing w:before="60" w:after="60" w:line="276" w:lineRule="auto"/>
-            </w:pPr>
-            <w:r>
-              <w:rPr>
-                <w:rFonts w:ascii="Calibri" w:hAnsi="Calibri" w:eastAsia="Calibri"/>
-                <w:b/>
-                <w:i w:val="0"/>
-                <w:color w:val="FFFFFF"/>
-                <w:sz w:val="18"/>
-              </w:rPr>
-              <w:t>Individual stipends</w:t>
-            </w:r>
-          </w:p>
-        </w:tc>
-        <w:tc>
-          <w:tcPr>
-            <w:tcW w:type="dxa" w:w="2324"/>
-            <w:shd w:fill="0A2540" w:val="clear"/>
-            <w:tcBorders>
-              <w:top w:val="single" w:sz="4" w:space="0" w:color="0A2540"/>
-              <w:left w:val="single" w:sz="4" w:space="0" w:color="0A2540"/>
-              <w:bottom w:val="single" w:sz="4" w:space="0" w:color="0A2540"/>
-              <w:right w:val="single" w:sz="4" w:space="0" w:color="0A2540"/>
-            </w:tcBorders>
-          </w:tcPr>
-          <w:p>
-            <w:pPr>
-              <w:spacing w:before="60" w:after="60" w:line="276" w:lineRule="auto"/>
-            </w:pPr>
-            <w:r>
-              <w:rPr>
-                <w:rFonts w:ascii="Calibri" w:hAnsi="Calibri" w:eastAsia="Calibri"/>
-                <w:b/>
-                <w:i w:val="0"/>
-                <w:color w:val="FFFFFF"/>
-                <w:sz w:val="18"/>
-              </w:rPr>
-              <w:t>ChatGPT Business</w:t>
-            </w:r>
-          </w:p>
-        </w:tc>
-        <w:tc>
-          <w:tcPr>
-            <w:tcW w:type="dxa" w:w="2268"/>
-            <w:shd w:fill="0A2540" w:val="clear"/>
-            <w:tcBorders>
-              <w:top w:val="single" w:sz="4" w:space="0" w:color="0A2540"/>
-              <w:left w:val="single" w:sz="4" w:space="0" w:color="0A2540"/>
-              <w:bottom w:val="single" w:sz="4" w:space="0" w:color="0A2540"/>
-              <w:right w:val="single" w:sz="4" w:space="0" w:color="0A2540"/>
-            </w:tcBorders>
-          </w:tcPr>
-          <w:p>
-            <w:pPr>
-              <w:spacing w:before="60" w:after="60" w:line="276" w:lineRule="auto"/>
-            </w:pPr>
-            <w:r>
-              <w:rPr>
-                <w:rFonts w:ascii="Calibri" w:hAnsi="Calibri" w:eastAsia="Calibri"/>
-                <w:b/>
-                <w:i w:val="0"/>
-                <w:color w:val="FFFFFF"/>
-                <w:sz w:val="18"/>
-              </w:rPr>
-              <w:t>OneAI</w:t>
-            </w:r>
-          </w:p>
-        </w:tc>
-      </w:tr>
-      <w:tr>
-        <w:tc>
-          <w:tcPr>
-            <w:tcW w:type="dxa" w:w="2494"/>
-            <w:shd w:fill="FFFFFF" w:val="clear"/>
-            <w:tcBorders>
-              <w:top w:val="single" w:sz="4" w:space="0" w:color="D9E4EE"/>
-              <w:left w:val="single" w:sz="4" w:space="0" w:color="D9E4EE"/>
-              <w:bottom w:val="single" w:sz="4" w:space="0" w:color="D9E4EE"/>
-              <w:right w:val="single" w:sz="4" w:space="0" w:color="D9E4EE"/>
-            </w:tcBorders>
-          </w:tcPr>
-          <w:p>
-            <w:pPr>
-              <w:spacing w:before="40" w:after="40" w:line="276" w:lineRule="auto"/>
-            </w:pPr>
-            <w:r>
-              <w:rPr>
-                <w:rFonts w:ascii="Calibri" w:hAnsi="Calibri" w:eastAsia="Calibri"/>
-                <w:b/>
-                <w:i w:val="0"/>
-                <w:color w:val="0A2540"/>
-                <w:sz w:val="18"/>
-              </w:rPr>
-              <w:t>Monthly cost</w:t>
-            </w:r>
-          </w:p>
-        </w:tc>
-        <w:tc>
-          <w:tcPr>
-            <w:tcW w:type="dxa" w:w="2324"/>
-            <w:shd w:fill="FFFFFF" w:val="clear"/>
-            <w:tcBorders>
-              <w:top w:val="single" w:sz="4" w:space="0" w:color="D9E4EE"/>
-              <w:left w:val="single" w:sz="4" w:space="0" w:color="D9E4EE"/>
-              <w:bottom w:val="single" w:sz="4" w:space="0" w:color="D9E4EE"/>
-              <w:right w:val="single" w:sz="4" w:space="0" w:color="D9E4EE"/>
-            </w:tcBorders>
-          </w:tcPr>
-          <w:p>
-            <w:pPr>
-              <w:spacing w:before="40" w:after="40" w:line="276" w:lineRule="auto"/>
-            </w:pPr>
-            <w:r>
-              <w:rPr>
-                <w:rFonts w:ascii="Calibri" w:hAnsi="Calibri" w:eastAsia="Calibri"/>
-                <w:b w:val="0"/>
-                <w:i w:val="0"/>
-                <w:color w:val="425466"/>
-                <w:sz w:val="18"/>
-              </w:rPr>
-              <w:t>Rp20.000.000</w:t>
-            </w:r>
-          </w:p>
-        </w:tc>
-        <w:tc>
-          <w:tcPr>
-            <w:tcW w:type="dxa" w:w="2324"/>
-            <w:shd w:fill="FFFFFF" w:val="clear"/>
-            <w:tcBorders>
-              <w:top w:val="single" w:sz="4" w:space="0" w:color="D9E4EE"/>
-              <w:left w:val="single" w:sz="4" w:space="0" w:color="D9E4EE"/>
-              <w:bottom w:val="single" w:sz="4" w:space="0" w:color="D9E4EE"/>
-              <w:right w:val="single" w:sz="4" w:space="0" w:color="D9E4EE"/>
-            </w:tcBorders>
-          </w:tcPr>
-          <w:p>
-            <w:pPr>
-              <w:spacing w:before="40" w:after="40" w:line="276" w:lineRule="auto"/>
-            </w:pPr>
-            <w:r>
-              <w:rPr>
-                <w:rFonts w:ascii="Calibri" w:hAnsi="Calibri" w:eastAsia="Calibri"/>
-                <w:b w:val="0"/>
-                <w:i w:val="0"/>
-                <w:color w:val="425466"/>
-                <w:sz w:val="18"/>
-              </w:rPr>
-              <w:t>Rp16.0M / Rp12.8M yr</w:t>
-            </w:r>
-          </w:p>
-        </w:tc>
-        <w:tc>
-          <w:tcPr>
-            <w:tcW w:type="dxa" w:w="2268"/>
-            <w:shd w:fill="FFFFFF" w:val="clear"/>
-            <w:tcBorders>
-              <w:top w:val="single" w:sz="4" w:space="0" w:color="D9E4EE"/>
-              <w:left w:val="single" w:sz="4" w:space="0" w:color="D9E4EE"/>
-              <w:bottom w:val="single" w:sz="4" w:space="0" w:color="D9E4EE"/>
-              <w:right w:val="single" w:sz="4" w:space="0" w:color="D9E4EE"/>
-            </w:tcBorders>
-          </w:tcPr>
-          <w:p>
-            <w:pPr>
-              <w:spacing w:before="40" w:after="40" w:line="276" w:lineRule="auto"/>
-            </w:pPr>
-            <w:r>
-              <w:rPr>
-                <w:rFonts w:ascii="Calibri" w:hAnsi="Calibri" w:eastAsia="Calibri"/>
-                <w:b/>
-                <w:i w:val="0"/>
-                <w:color w:val="0A2540"/>
-                <w:sz w:val="18"/>
-              </w:rPr>
-              <w:t>Rp12.400.000 · fixed</w:t>
-            </w:r>
-          </w:p>
-        </w:tc>
-      </w:tr>
-      <w:tr>
-        <w:tc>
-          <w:tcPr>
-            <w:tcW w:type="dxa" w:w="2494"/>
-            <w:shd w:fill="F6F8F9" w:val="clear"/>
-            <w:tcBorders>
-              <w:top w:val="single" w:sz="4" w:space="0" w:color="D9E4EE"/>
-              <w:left w:val="single" w:sz="4" w:space="0" w:color="D9E4EE"/>
-              <w:bottom w:val="single" w:sz="4" w:space="0" w:color="D9E4EE"/>
-              <w:right w:val="single" w:sz="4" w:space="0" w:color="D9E4EE"/>
-            </w:tcBorders>
-          </w:tcPr>
-          <w:p>
-            <w:pPr>
-              <w:spacing w:before="40" w:after="40" w:line="276" w:lineRule="auto"/>
-            </w:pPr>
-            <w:r>
-              <w:rPr>
-                <w:rFonts w:ascii="Calibri" w:hAnsi="Calibri" w:eastAsia="Calibri"/>
-                <w:b/>
-                <w:i w:val="0"/>
-                <w:color w:val="0A2540"/>
-                <w:sz w:val="18"/>
-              </w:rPr>
-              <w:t>Usage budget</w:t>
-            </w:r>
-          </w:p>
-        </w:tc>
-        <w:tc>
-          <w:tcPr>
-            <w:tcW w:type="dxa" w:w="2324"/>
-            <w:shd w:fill="F6F8F9" w:val="clear"/>
-            <w:tcBorders>
-              <w:top w:val="single" w:sz="4" w:space="0" w:color="D9E4EE"/>
-              <w:left w:val="single" w:sz="4" w:space="0" w:color="D9E4EE"/>
-              <w:bottom w:val="single" w:sz="4" w:space="0" w:color="D9E4EE"/>
-              <w:right w:val="single" w:sz="4" w:space="0" w:color="D9E4EE"/>
-            </w:tcBorders>
-          </w:tcPr>
-          <w:p>
-            <w:pPr>
-              <w:spacing w:before="40" w:after="40" w:line="276" w:lineRule="auto"/>
-            </w:pPr>
-            <w:r>
-              <w:rPr>
-                <w:rFonts w:ascii="Calibri" w:hAnsi="Calibri" w:eastAsia="Calibri"/>
-                <w:b w:val="0"/>
-                <w:i w:val="0"/>
-                <w:color w:val="425466"/>
-                <w:sz w:val="18"/>
-              </w:rPr>
-              <w:t>No</w:t>
-            </w:r>
-          </w:p>
-        </w:tc>
-        <w:tc>
-          <w:tcPr>
-            <w:tcW w:type="dxa" w:w="2324"/>
-            <w:shd w:fill="F6F8F9" w:val="clear"/>
-            <w:tcBorders>
-              <w:top w:val="single" w:sz="4" w:space="0" w:color="D9E4EE"/>
-              <w:left w:val="single" w:sz="4" w:space="0" w:color="D9E4EE"/>
-              <w:bottom w:val="single" w:sz="4" w:space="0" w:color="D9E4EE"/>
-              <w:right w:val="single" w:sz="4" w:space="0" w:color="D9E4EE"/>
-            </w:tcBorders>
-          </w:tcPr>
-          <w:p>
-            <w:pPr>
-              <w:spacing w:before="40" w:after="40" w:line="276" w:lineRule="auto"/>
-            </w:pPr>
-            <w:r>
-              <w:rPr>
-                <w:rFonts w:ascii="Calibri" w:hAnsi="Calibri" w:eastAsia="Calibri"/>
-                <w:b w:val="0"/>
-                <w:i w:val="0"/>
-                <w:color w:val="425466"/>
-                <w:sz w:val="18"/>
-              </w:rPr>
-              <w:t>Included in ChatGPT</w:t>
-            </w:r>
-          </w:p>
-        </w:tc>
-        <w:tc>
-          <w:tcPr>
-            <w:tcW w:type="dxa" w:w="2268"/>
-            <w:shd w:fill="F6F8F9" w:val="clear"/>
-            <w:tcBorders>
-              <w:top w:val="single" w:sz="4" w:space="0" w:color="D9E4EE"/>
-              <w:left w:val="single" w:sz="4" w:space="0" w:color="D9E4EE"/>
-              <w:bottom w:val="single" w:sz="4" w:space="0" w:color="D9E4EE"/>
-              <w:right w:val="single" w:sz="4" w:space="0" w:color="D9E4EE"/>
-            </w:tcBorders>
-          </w:tcPr>
-          <w:p>
-            <w:pPr>
-              <w:spacing w:before="40" w:after="40" w:line="276" w:lineRule="auto"/>
-            </w:pPr>
-            <w:r>
-              <w:rPr>
-                <w:rFonts w:ascii="Calibri" w:hAnsi="Calibri" w:eastAsia="Calibri"/>
-                <w:b/>
-                <w:i w:val="0"/>
-                <w:color w:val="0A2540"/>
-                <w:sz w:val="18"/>
-              </w:rPr>
-              <w:t>USD 300 across providers</w:t>
-            </w:r>
-          </w:p>
-        </w:tc>
-      </w:tr>
-      <w:tr>
-        <w:tc>
-          <w:tcPr>
-            <w:tcW w:type="dxa" w:w="2494"/>
-            <w:shd w:fill="FFFFFF" w:val="clear"/>
-            <w:tcBorders>
-              <w:top w:val="single" w:sz="4" w:space="0" w:color="D9E4EE"/>
-              <w:left w:val="single" w:sz="4" w:space="0" w:color="D9E4EE"/>
-              <w:bottom w:val="single" w:sz="4" w:space="0" w:color="D9E4EE"/>
-              <w:right w:val="single" w:sz="4" w:space="0" w:color="D9E4EE"/>
-            </w:tcBorders>
-          </w:tcPr>
-          <w:p>
-            <w:pPr>
-              <w:spacing w:before="40" w:after="40" w:line="276" w:lineRule="auto"/>
-            </w:pPr>
-            <w:r>
-              <w:rPr>
-                <w:rFonts w:ascii="Calibri" w:hAnsi="Calibri" w:eastAsia="Calibri"/>
-                <w:b/>
-                <w:i w:val="0"/>
-                <w:color w:val="0A2540"/>
-                <w:sz w:val="18"/>
-              </w:rPr>
-              <w:t>ZDR</w:t>
-            </w:r>
-          </w:p>
-        </w:tc>
-        <w:tc>
-          <w:tcPr>
-            <w:tcW w:type="dxa" w:w="2324"/>
-            <w:shd w:fill="FFFFFF" w:val="clear"/>
-            <w:tcBorders>
-              <w:top w:val="single" w:sz="4" w:space="0" w:color="D9E4EE"/>
-              <w:left w:val="single" w:sz="4" w:space="0" w:color="D9E4EE"/>
-              <w:bottom w:val="single" w:sz="4" w:space="0" w:color="D9E4EE"/>
-              <w:right w:val="single" w:sz="4" w:space="0" w:color="D9E4EE"/>
-            </w:tcBorders>
-          </w:tcPr>
-          <w:p>
-            <w:pPr>
-              <w:spacing w:before="40" w:after="40" w:line="276" w:lineRule="auto"/>
-            </w:pPr>
-            <w:r>
-              <w:rPr>
-                <w:rFonts w:ascii="Calibri" w:hAnsi="Calibri" w:eastAsia="Calibri"/>
-                <w:b w:val="0"/>
-                <w:i w:val="0"/>
-                <w:color w:val="425466"/>
-                <w:sz w:val="18"/>
-              </w:rPr>
-              <w:t>No</w:t>
-            </w:r>
-          </w:p>
-        </w:tc>
-        <w:tc>
-          <w:tcPr>
-            <w:tcW w:type="dxa" w:w="2324"/>
-            <w:shd w:fill="FFFFFF" w:val="clear"/>
-            <w:tcBorders>
-              <w:top w:val="single" w:sz="4" w:space="0" w:color="D9E4EE"/>
-              <w:left w:val="single" w:sz="4" w:space="0" w:color="D9E4EE"/>
-              <w:bottom w:val="single" w:sz="4" w:space="0" w:color="D9E4EE"/>
-              <w:right w:val="single" w:sz="4" w:space="0" w:color="D9E4EE"/>
-            </w:tcBorders>
-          </w:tcPr>
-          <w:p>
-            <w:pPr>
-              <w:spacing w:before="40" w:after="40" w:line="276" w:lineRule="auto"/>
-            </w:pPr>
-            <w:r>
-              <w:rPr>
-                <w:rFonts w:ascii="Calibri" w:hAnsi="Calibri" w:eastAsia="Calibri"/>
-                <w:b w:val="0"/>
-                <w:i w:val="0"/>
-                <w:color w:val="425466"/>
-                <w:sz w:val="18"/>
-              </w:rPr>
-              <w:t>Not ZDR</w:t>
-            </w:r>
-          </w:p>
-        </w:tc>
-        <w:tc>
-          <w:tcPr>
-            <w:tcW w:type="dxa" w:w="2268"/>
-            <w:shd w:fill="FFFFFF" w:val="clear"/>
-            <w:tcBorders>
-              <w:top w:val="single" w:sz="4" w:space="0" w:color="D9E4EE"/>
-              <w:left w:val="single" w:sz="4" w:space="0" w:color="D9E4EE"/>
-              <w:bottom w:val="single" w:sz="4" w:space="0" w:color="D9E4EE"/>
-              <w:right w:val="single" w:sz="4" w:space="0" w:color="D9E4EE"/>
-            </w:tcBorders>
-          </w:tcPr>
-          <w:p>
-            <w:pPr>
-              <w:spacing w:before="40" w:after="40" w:line="276" w:lineRule="auto"/>
-            </w:pPr>
-            <w:r>
-              <w:rPr>
-                <w:rFonts w:ascii="Calibri" w:hAnsi="Calibri" w:eastAsia="Calibri"/>
-                <w:b/>
-                <w:i w:val="0"/>
-                <w:color w:val="0A2540"/>
-                <w:sz w:val="18"/>
-              </w:rPr>
-              <w:t>Yes</w:t>
-            </w:r>
-          </w:p>
-        </w:tc>
-      </w:tr>
-      <w:tr>
-        <w:tc>
-          <w:tcPr>
-            <w:tcW w:type="dxa" w:w="2494"/>
-            <w:shd w:fill="F6F8F9" w:val="clear"/>
-            <w:tcBorders>
-              <w:top w:val="single" w:sz="4" w:space="0" w:color="D9E4EE"/>
-              <w:left w:val="single" w:sz="4" w:space="0" w:color="D9E4EE"/>
-              <w:bottom w:val="single" w:sz="4" w:space="0" w:color="D9E4EE"/>
-              <w:right w:val="single" w:sz="4" w:space="0" w:color="D9E4EE"/>
-            </w:tcBorders>
-          </w:tcPr>
-          <w:p>
-            <w:pPr>
-              <w:spacing w:before="40" w:after="40" w:line="276" w:lineRule="auto"/>
-            </w:pPr>
-            <w:r>
-              <w:rPr>
-                <w:rFonts w:ascii="Calibri" w:hAnsi="Calibri" w:eastAsia="Calibri"/>
-                <w:b/>
-                <w:i w:val="0"/>
-                <w:color w:val="0A2540"/>
-                <w:sz w:val="18"/>
-              </w:rPr>
-              <w:t>On-prem or isolated instance</w:t>
-            </w:r>
-          </w:p>
-        </w:tc>
-        <w:tc>
-          <w:tcPr>
-            <w:tcW w:type="dxa" w:w="2324"/>
-            <w:shd w:fill="F6F8F9" w:val="clear"/>
-            <w:tcBorders>
-              <w:top w:val="single" w:sz="4" w:space="0" w:color="D9E4EE"/>
-              <w:left w:val="single" w:sz="4" w:space="0" w:color="D9E4EE"/>
-              <w:bottom w:val="single" w:sz="4" w:space="0" w:color="D9E4EE"/>
-              <w:right w:val="single" w:sz="4" w:space="0" w:color="D9E4EE"/>
-            </w:tcBorders>
-          </w:tcPr>
-          <w:p>
-            <w:pPr>
-              <w:spacing w:before="40" w:after="40" w:line="276" w:lineRule="auto"/>
-            </w:pPr>
-            <w:r>
-              <w:rPr>
-                <w:rFonts w:ascii="Calibri" w:hAnsi="Calibri" w:eastAsia="Calibri"/>
-                <w:b w:val="0"/>
-                <w:i w:val="0"/>
-                <w:color w:val="425466"/>
-                <w:sz w:val="18"/>
-              </w:rPr>
-              <w:t>No</w:t>
-            </w:r>
-          </w:p>
-        </w:tc>
-        <w:tc>
-          <w:tcPr>
-            <w:tcW w:type="dxa" w:w="2324"/>
-            <w:shd w:fill="F6F8F9" w:val="clear"/>
-            <w:tcBorders>
-              <w:top w:val="single" w:sz="4" w:space="0" w:color="D9E4EE"/>
-              <w:left w:val="single" w:sz="4" w:space="0" w:color="D9E4EE"/>
-              <w:bottom w:val="single" w:sz="4" w:space="0" w:color="D9E4EE"/>
-              <w:right w:val="single" w:sz="4" w:space="0" w:color="D9E4EE"/>
-            </w:tcBorders>
-          </w:tcPr>
-          <w:p>
-            <w:pPr>
-              <w:spacing w:before="40" w:after="40" w:line="276" w:lineRule="auto"/>
-            </w:pPr>
-            <w:r>
-              <w:rPr>
-                <w:rFonts w:ascii="Calibri" w:hAnsi="Calibri" w:eastAsia="Calibri"/>
-                <w:b w:val="0"/>
-                <w:i w:val="0"/>
-                <w:color w:val="425466"/>
-                <w:sz w:val="18"/>
-              </w:rPr>
-              <w:t>Vendor cloud</w:t>
-            </w:r>
-          </w:p>
-        </w:tc>
-        <w:tc>
-          <w:tcPr>
-            <w:tcW w:type="dxa" w:w="2268"/>
-            <w:shd w:fill="F6F8F9" w:val="clear"/>
-            <w:tcBorders>
-              <w:top w:val="single" w:sz="4" w:space="0" w:color="D9E4EE"/>
-              <w:left w:val="single" w:sz="4" w:space="0" w:color="D9E4EE"/>
-              <w:bottom w:val="single" w:sz="4" w:space="0" w:color="D9E4EE"/>
-              <w:right w:val="single" w:sz="4" w:space="0" w:color="D9E4EE"/>
-            </w:tcBorders>
-          </w:tcPr>
-          <w:p>
-            <w:pPr>
-              <w:spacing w:before="40" w:after="40" w:line="276" w:lineRule="auto"/>
-            </w:pPr>
-            <w:r>
-              <w:rPr>
-                <w:rFonts w:ascii="Calibri" w:hAnsi="Calibri" w:eastAsia="Calibri"/>
-                <w:b/>
-                <w:i w:val="0"/>
-                <w:color w:val="0A2540"/>
-                <w:sz w:val="18"/>
-              </w:rPr>
-              <w:t>Yes</w:t>
-            </w:r>
-          </w:p>
-        </w:tc>
-      </w:tr>
-      <w:tr>
-        <w:tc>
-          <w:tcPr>
-            <w:tcW w:type="dxa" w:w="2494"/>
-            <w:shd w:fill="FFFFFF" w:val="clear"/>
-            <w:tcBorders>
-              <w:top w:val="single" w:sz="4" w:space="0" w:color="D9E4EE"/>
-              <w:left w:val="single" w:sz="4" w:space="0" w:color="D9E4EE"/>
-              <w:bottom w:val="single" w:sz="4" w:space="0" w:color="D9E4EE"/>
-              <w:right w:val="single" w:sz="4" w:space="0" w:color="D9E4EE"/>
-            </w:tcBorders>
-          </w:tcPr>
-          <w:p>
-            <w:pPr>
-              <w:spacing w:before="40" w:after="40" w:line="276" w:lineRule="auto"/>
-            </w:pPr>
-            <w:r>
-              <w:rPr>
-                <w:rFonts w:ascii="Calibri" w:hAnsi="Calibri" w:eastAsia="Calibri"/>
-                <w:b/>
-                <w:i w:val="0"/>
-                <w:color w:val="0A2540"/>
-                <w:sz w:val="18"/>
-              </w:rPr>
-              <w:t>One invoice &amp; usage reports</w:t>
-            </w:r>
-          </w:p>
-        </w:tc>
-        <w:tc>
-          <w:tcPr>
-            <w:tcW w:type="dxa" w:w="2324"/>
-            <w:shd w:fill="FFFFFF" w:val="clear"/>
-            <w:tcBorders>
-              <w:top w:val="single" w:sz="4" w:space="0" w:color="D9E4EE"/>
-              <w:left w:val="single" w:sz="4" w:space="0" w:color="D9E4EE"/>
-              <w:bottom w:val="single" w:sz="4" w:space="0" w:color="D9E4EE"/>
-              <w:right w:val="single" w:sz="4" w:space="0" w:color="D9E4EE"/>
-            </w:tcBorders>
-          </w:tcPr>
-          <w:p>
-            <w:pPr>
-              <w:spacing w:before="40" w:after="40" w:line="276" w:lineRule="auto"/>
-            </w:pPr>
-            <w:r>
-              <w:rPr>
-                <w:rFonts w:ascii="Calibri" w:hAnsi="Calibri" w:eastAsia="Calibri"/>
-                <w:b w:val="0"/>
-                <w:i w:val="0"/>
-                <w:color w:val="425466"/>
-                <w:sz w:val="18"/>
-              </w:rPr>
-              <w:t>No</w:t>
-            </w:r>
-          </w:p>
-        </w:tc>
-        <w:tc>
-          <w:tcPr>
-            <w:tcW w:type="dxa" w:w="2324"/>
-            <w:shd w:fill="FFFFFF" w:val="clear"/>
-            <w:tcBorders>
-              <w:top w:val="single" w:sz="4" w:space="0" w:color="D9E4EE"/>
-              <w:left w:val="single" w:sz="4" w:space="0" w:color="D9E4EE"/>
-              <w:bottom w:val="single" w:sz="4" w:space="0" w:color="D9E4EE"/>
-              <w:right w:val="single" w:sz="4" w:space="0" w:color="D9E4EE"/>
-            </w:tcBorders>
-          </w:tcPr>
-          <w:p>
-            <w:pPr>
-              <w:spacing w:before="40" w:after="40" w:line="276" w:lineRule="auto"/>
-            </w:pPr>
-            <w:r>
-              <w:rPr>
-                <w:rFonts w:ascii="Calibri" w:hAnsi="Calibri" w:eastAsia="Calibri"/>
-                <w:b w:val="0"/>
-                <w:i w:val="0"/>
-                <w:color w:val="425466"/>
-                <w:sz w:val="18"/>
-              </w:rPr>
-              <w:t>ChatGPT only</w:t>
-            </w:r>
-          </w:p>
-        </w:tc>
-        <w:tc>
-          <w:tcPr>
-            <w:tcW w:type="dxa" w:w="2268"/>
-            <w:shd w:fill="FFFFFF" w:val="clear"/>
-            <w:tcBorders>
-              <w:top w:val="single" w:sz="4" w:space="0" w:color="D9E4EE"/>
-              <w:left w:val="single" w:sz="4" w:space="0" w:color="D9E4EE"/>
-              <w:bottom w:val="single" w:sz="4" w:space="0" w:color="D9E4EE"/>
-              <w:right w:val="single" w:sz="4" w:space="0" w:color="D9E4EE"/>
-            </w:tcBorders>
-          </w:tcPr>
-          <w:p>
-            <w:pPr>
-              <w:spacing w:before="40" w:after="40" w:line="276" w:lineRule="auto"/>
-            </w:pPr>
-            <w:r>
-              <w:rPr>
-                <w:rFonts w:ascii="Calibri" w:hAnsi="Calibri" w:eastAsia="Calibri"/>
-                <w:b/>
-                <w:i w:val="0"/>
-                <w:color w:val="0A2540"/>
-                <w:sz w:val="18"/>
-              </w:rPr>
-              <w:t>Yes · all models</w:t>
-            </w:r>
-          </w:p>
-        </w:tc>
-      </w:tr>
-    </w:tbl>
-    <w:p>
-      <w:pPr>
-        <w:spacing w:before="120" w:after="80" w:line="276" w:lineRule="auto"/>
-      </w:pPr>
-      <w:r>
-        <w:rPr>
-          <w:rFonts w:ascii="Calibri" w:hAnsi="Calibri" w:eastAsia="Calibri"/>
-          <w:b w:val="0"/>
-          <w:i/>
-          <w:color w:val="8898AA"/>
-          <w:sz w:val="18"/>
-        </w:rPr>
-        <w:t>Assumptions in the public comparison: Rp16.000/USD; stipend example Rp500.000/person; ChatGPT Business $25/user monthly or $20/user annually. ChatGPT includes model usage; extra credits are optional. Competitor prices may change; these figures are for comparison, not their quotes. Tax is extra.</w:t>
-      </w:r>
-    </w:p>
-    <w:p>
-      <w:pPr>
-        <w:spacing w:before="280" w:after="120" w:line="276" w:lineRule="auto"/>
-      </w:pPr>
-      <w:r>
-        <w:rPr>
-          <w:rFonts w:ascii="Calibri" w:hAnsi="Calibri" w:eastAsia="Calibri"/>
-          <w:b/>
-          <w:i w:val="0"/>
-          <w:color w:val="0A2540"/>
-          <w:sz w:val="26"/>
-        </w:rPr>
-        <w:t>5. Proposed next step</w:t>
-      </w:r>
-    </w:p>
-    <w:p>
-      <w:pPr>
-        <w:spacing w:before="0" w:after="60" w:line="276" w:lineRule="auto"/>
-      </w:pPr>
-      <w:r>
-        <w:rPr>
-          <w:rFonts w:ascii="Calibri" w:hAnsi="Calibri" w:eastAsia="Calibri"/>
-          <w:b w:val="0"/>
-          <w:i w:val="0"/>
-          <w:color w:val="425466"/>
-          <w:sz w:val="22"/>
-        </w:rPr>
-        <w:t>1. Review the attached two-page overview.</w:t>
-      </w:r>
-    </w:p>
-    <w:p>
-      <w:pPr>
-        <w:spacing w:before="0" w:after="60" w:line="276" w:lineRule="auto"/>
-      </w:pPr>
-      <w:r>
-        <w:rPr>
-          <w:rFonts w:ascii="Calibri" w:hAnsi="Calibri" w:eastAsia="Calibri"/>
-          <w:b w:val="0"/>
-          <w:i w:val="0"/>
-          <w:color w:val="425466"/>
-          <w:sz w:val="22"/>
-        </w:rPr>
-        <w:t>2. Approve a 30-minute call with Hyperjump (solution@hyperjump.tech) to confirm fit, onboarding, and commercial terms.</w:t>
-      </w:r>
-    </w:p>
-    <w:p>
-      <w:pPr>
-        <w:spacing w:before="0" w:after="60" w:line="276" w:lineRule="auto"/>
-      </w:pPr>
-      <w:r>
-        <w:rPr>
-          <w:rFonts w:ascii="Calibri" w:hAnsi="Calibri" w:eastAsia="Calibri"/>
-          <w:b w:val="0"/>
-          <w:i w:val="0"/>
-          <w:color w:val="425466"/>
-          <w:sz w:val="22"/>
-        </w:rPr>
-        <w:t>3. Decide after that call: adopt, wait, or stay with the current approach.</w:t>
-      </w:r>
-    </w:p>
-    <w:p>
-      <w:pPr>
-        <w:spacing w:before="0" w:after="160" w:line="276" w:lineRule="auto"/>
-        <w:jc w:val="both"/>
-      </w:pPr>
-      <w:r>
-        <w:rPr>
-          <w:rFonts w:ascii="Calibri" w:hAnsi="Calibri" w:eastAsia="Calibri"/>
-          <w:b w:val="0"/>
-          <w:i w:val="0"/>
-          <w:color w:val="425466"/>
-          <w:sz w:val="22"/>
-        </w:rPr>
-        <w:t>I am happy to coordinate the conversation and report back.</w:t>
-      </w:r>
-    </w:p>
-    <w:p>
-      <w:pPr>
-        <w:spacing w:before="240" w:after="320" w:line="276" w:lineRule="auto"/>
+        <w:spacing w:before="160" w:after="160" w:line="259" w:lineRule="auto"/>
       </w:pPr>
       <w:r>
         <w:rPr>
@@ -1707,7 +739,7 @@
     </w:p>
     <w:p>
       <w:pPr>
-        <w:spacing w:before="0" w:after="20" w:line="276" w:lineRule="auto"/>
+        <w:spacing w:before="0" w:after="0" w:line="259" w:lineRule="auto"/>
       </w:pPr>
       <w:r>
         <w:rPr>
@@ -1723,7 +755,7 @@
     </w:p>
     <w:p>
       <w:pPr>
-        <w:spacing w:before="0" w:after="20" w:line="276" w:lineRule="auto"/>
+        <w:spacing w:before="0" w:after="0" w:line="259" w:lineRule="auto"/>
       </w:pPr>
       <w:r>
         <w:rPr>
@@ -1731,7 +763,7 @@
           <w:b/>
           <w:i w:val="0"/>
           <w:color w:val="8A5A00"/>
-          <w:sz w:val="22"/>
+          <w:sz w:val="21"/>
           <w:highlight w:val="yellow"/>
         </w:rPr>
         <w:t>[Role / department]</w:t>
@@ -1739,7 +771,7 @@
     </w:p>
     <w:p>
       <w:pPr>
-        <w:spacing w:before="0" w:after="20" w:line="276" w:lineRule="auto"/>
+        <w:spacing w:before="0" w:after="0" w:line="259" w:lineRule="auto"/>
       </w:pPr>
       <w:r>
         <w:rPr>
@@ -1755,9 +787,9 @@
     </w:p>
     <w:p>
       <w:pPr>
-        <w:spacing w:before="320" w:after="0" w:line="276" w:lineRule="auto"/>
+        <w:spacing w:before="200" w:after="0" w:line="259" w:lineRule="auto"/>
         <w:pBdr>
-          <w:top w:val="single" w:sz="8" w:space="8" w:color="0A2540"/>
+          <w:top w:val="single" w:sz="8" w:space="6" w:color="0A2540"/>
         </w:pBdr>
       </w:pPr>
       <w:r>
@@ -1773,7 +805,7 @@
     </w:p>
     <w:sectPr>
       <w:pgSz w:w="11906" w:h="16838"/>
-      <w:pgMar w:top="1020" w:right="1247" w:bottom="1020" w:left="1247" w:header="720" w:footer="720" w:gutter="0"/>
+      <w:pgMar w:top="850" w:right="1247" w:bottom="850" w:left="1247" w:header="720" w:footer="720" w:gutter="0"/>
       <w:cols w:space="720"/>
       <w:docGrid w:linePitch="360"/>
     </w:sectPr>

</xml_diff>